<commit_message>
Add upper-body skeleton compare flow
</commit_message>
<xml_diff>
--- a/Docs/ExerciseTogether_Code_Exam_Guide_TH.docx
+++ b/Docs/ExerciseTogether_Code_Exam_Guide_TH.docx
@@ -42,29 +42,13 @@
             <w:shd w:fill="F4F6F9"/>
           </w:tcPr>
           <w:p>
-            <w:pPr>
-              <w:spacing w:after="80"/>
-            </w:pPr>
             <w:r>
               <w:rPr>
-                <w:rFonts w:ascii="Arial" w:hAnsi="Arial" w:eastAsia="Arial"/>
-                <w:b/>
-                <w:color w:val="1F4D78"/>
-                <w:sz w:val="21"/>
+                <w:rFonts w:ascii="Arial" w:hAnsi="Arial"/>
               </w:rPr>
               <w:t>ภาพรวมสั้นที่สุด</w:t>
-            </w:r>
-          </w:p>
-          <w:p>
-            <w:pPr>
-              <w:spacing w:after="0"/>
-            </w:pPr>
-            <w:r>
-              <w:rPr>
-                <w:rFonts w:ascii="Arial" w:hAnsi="Arial" w:eastAsia="Arial"/>
-                <w:sz w:val="20"/>
-              </w:rPr>
-              <w:t>แอปนี้เป็น Standalone iOS App ที่ใช้ SwiftUI + Core Data + Apple Vision เพื่อตรวจท่าบริหารร่างกายแบบ upper-body-only กล้องส่งภาพให้ Vision ตรวจ joint แล้ว PoseEstimator คำนวณมุม/นับ rep/ประเมิน form จากนั้นบันทึกผลลง Core Data และถ้าเป็น live tracking จะบันทึกวิดีโอไปที่ Photos ด้วย ส่วน Compare ใช้วิดีโอ reference เทียบกับวิดีโอที่ผู้ใช้อัปโหลดเพื่อคำนวณ accuracy.</w:t>
+              <w:br/>
+              <w:t>แอปนี้เป็น Standalone iOS App ที่ใช้ SwiftUI + Core Data + Apple Vision เพื่อตรวจท่าบริหารร่างกายแบบ upper-body-only กล้องหรือวิดีโอส่งภาพให้ Vision ตรวจ joint แล้ว PoseEstimator คำนวณมุม/นับ rep/ประเมิน form จากนั้นบันทึกผลลง Core Data และถ้าเป็น live tracking จะบันทึกวิดีโอไปที่ Photos ด้วย หน้าจอ Form และ Compare จะแสดง skeleton เฉพาะ nose/shoulder/elbow/wrist/hip ไม่วาดเท้า ส่วน Compare ใช้วิดีโอ reference เล่นพร้อมกับวิดีโอผู้ใช้ และคำนวณ accuracy แบบทนต่อภาพ mirror จากกล้องหน้าและ timing ที่เหลื่อมเล็กน้อย.</w:t>
             </w:r>
           </w:p>
         </w:tc>
@@ -101,7 +85,11 @@
             <w:pPr>
               <w:spacing w:after="0"/>
             </w:pPr>
-            <w:r/>
+            <w:r>
+              <w:rPr>
+                <w:rFonts w:ascii="Arial" w:hAnsi="Arial"/>
+              </w:rPr>
+            </w:r>
             <w:r>
               <w:rPr>
                 <w:rFonts w:ascii="Arial" w:hAnsi="Arial" w:eastAsia="Arial"/>
@@ -123,7 +111,11 @@
             <w:pPr>
               <w:spacing w:after="0"/>
             </w:pPr>
-            <w:r/>
+            <w:r>
+              <w:rPr>
+                <w:rFonts w:ascii="Arial" w:hAnsi="Arial"/>
+              </w:rPr>
+            </w:r>
             <w:r>
               <w:rPr>
                 <w:rFonts w:ascii="Arial" w:hAnsi="Arial" w:eastAsia="Arial"/>
@@ -145,7 +137,11 @@
             <w:pPr>
               <w:spacing w:after="0"/>
             </w:pPr>
-            <w:r/>
+            <w:r>
+              <w:rPr>
+                <w:rFonts w:ascii="Arial" w:hAnsi="Arial"/>
+              </w:rPr>
+            </w:r>
             <w:r>
               <w:rPr>
                 <w:rFonts w:ascii="Arial" w:hAnsi="Arial" w:eastAsia="Arial"/>
@@ -168,7 +164,11 @@
             <w:pPr>
               <w:spacing w:after="0"/>
             </w:pPr>
-            <w:r/>
+            <w:r>
+              <w:rPr>
+                <w:rFonts w:ascii="Arial" w:hAnsi="Arial"/>
+              </w:rPr>
+            </w:r>
             <w:r>
               <w:rPr>
                 <w:rFonts w:ascii="Arial" w:hAnsi="Arial" w:eastAsia="Arial"/>
@@ -188,7 +188,11 @@
             <w:pPr>
               <w:spacing w:after="0"/>
             </w:pPr>
-            <w:r/>
+            <w:r>
+              <w:rPr>
+                <w:rFonts w:ascii="Arial" w:hAnsi="Arial"/>
+              </w:rPr>
+            </w:r>
             <w:r>
               <w:rPr>
                 <w:rFonts w:ascii="Arial" w:hAnsi="Arial" w:eastAsia="Arial"/>
@@ -205,17 +209,11 @@
             <w:vAlign w:val="top"/>
           </w:tcPr>
           <w:p>
-            <w:pPr>
-              <w:spacing w:after="0"/>
-            </w:pPr>
-            <w:r/>
             <w:r>
               <w:rPr>
-                <w:rFonts w:ascii="Arial" w:hAnsi="Arial" w:eastAsia="Arial"/>
-                <w:b w:val="0"/>
-                <w:sz w:val="18"/>
+                <w:rFonts w:ascii="Arial" w:hAnsi="Arial"/>
               </w:rPr>
-              <w:t>ควบคุม bottom tab, เก็บ AppNavigationState, ส่ง reference video ไปหน้า Compare</w:t>
+              <w:t>ควบคุม bottom tab, เก็บ AppNavigationState, ส่ง exercise ไป Form และส่ง reference video ไป Compare</w:t>
             </w:r>
           </w:p>
         </w:tc>
@@ -230,7 +228,11 @@
             <w:pPr>
               <w:spacing w:after="0"/>
             </w:pPr>
-            <w:r/>
+            <w:r>
+              <w:rPr>
+                <w:rFonts w:ascii="Arial" w:hAnsi="Arial"/>
+              </w:rPr>
+            </w:r>
             <w:r>
               <w:rPr>
                 <w:rFonts w:ascii="Arial" w:hAnsi="Arial" w:eastAsia="Arial"/>
@@ -250,7 +252,11 @@
             <w:pPr>
               <w:spacing w:after="0"/>
             </w:pPr>
-            <w:r/>
+            <w:r>
+              <w:rPr>
+                <w:rFonts w:ascii="Arial" w:hAnsi="Arial"/>
+              </w:rPr>
+            </w:r>
             <w:r>
               <w:rPr>
                 <w:rFonts w:ascii="Arial" w:hAnsi="Arial" w:eastAsia="Arial"/>
@@ -270,7 +276,11 @@
             <w:pPr>
               <w:spacing w:after="0"/>
             </w:pPr>
-            <w:r/>
+            <w:r>
+              <w:rPr>
+                <w:rFonts w:ascii="Arial" w:hAnsi="Arial"/>
+              </w:rPr>
+            </w:r>
             <w:r>
               <w:rPr>
                 <w:rFonts w:ascii="Arial" w:hAnsi="Arial" w:eastAsia="Arial"/>
@@ -292,7 +302,11 @@
             <w:pPr>
               <w:spacing w:after="0"/>
             </w:pPr>
-            <w:r/>
+            <w:r>
+              <w:rPr>
+                <w:rFonts w:ascii="Arial" w:hAnsi="Arial"/>
+              </w:rPr>
+            </w:r>
             <w:r>
               <w:rPr>
                 <w:rFonts w:ascii="Arial" w:hAnsi="Arial" w:eastAsia="Arial"/>
@@ -312,7 +326,11 @@
             <w:pPr>
               <w:spacing w:after="0"/>
             </w:pPr>
-            <w:r/>
+            <w:r>
+              <w:rPr>
+                <w:rFonts w:ascii="Arial" w:hAnsi="Arial"/>
+              </w:rPr>
+            </w:r>
             <w:r>
               <w:rPr>
                 <w:rFonts w:ascii="Arial" w:hAnsi="Arial" w:eastAsia="Arial"/>
@@ -329,17 +347,11 @@
             <w:vAlign w:val="top"/>
           </w:tcPr>
           <w:p>
-            <w:pPr>
-              <w:spacing w:after="0"/>
-            </w:pPr>
-            <w:r/>
             <w:r>
               <w:rPr>
-                <w:rFonts w:ascii="Arial" w:hAnsi="Arial" w:eastAsia="Arial"/>
-                <w:b w:val="0"/>
-                <w:sz w:val="18"/>
+                <w:rFonts w:ascii="Arial" w:hAnsi="Arial"/>
               </w:rPr>
-              <w:t>เลือก exercise, เริ่ม/หยุด tracking, แสดงกล้อง, บันทึกผลลง Core Data</w:t>
+              <w:t>เลือก exercise, เริ่ม/หยุด tracking, แสดงกล้อง/วิดีโอพร้อม upper-body skeleton, บันทึกผลลง Core Data</w:t>
             </w:r>
           </w:p>
         </w:tc>
@@ -354,7 +366,11 @@
             <w:pPr>
               <w:spacing w:after="0"/>
             </w:pPr>
-            <w:r/>
+            <w:r>
+              <w:rPr>
+                <w:rFonts w:ascii="Arial" w:hAnsi="Arial"/>
+              </w:rPr>
+            </w:r>
             <w:r>
               <w:rPr>
                 <w:rFonts w:ascii="Arial" w:hAnsi="Arial" w:eastAsia="Arial"/>
@@ -374,7 +390,11 @@
             <w:pPr>
               <w:spacing w:after="0"/>
             </w:pPr>
-            <w:r/>
+            <w:r>
+              <w:rPr>
+                <w:rFonts w:ascii="Arial" w:hAnsi="Arial"/>
+              </w:rPr>
+            </w:r>
             <w:r>
               <w:rPr>
                 <w:rFonts w:ascii="Arial" w:hAnsi="Arial" w:eastAsia="Arial"/>
@@ -394,7 +414,11 @@
             <w:pPr>
               <w:spacing w:after="0"/>
             </w:pPr>
-            <w:r/>
+            <w:r>
+              <w:rPr>
+                <w:rFonts w:ascii="Arial" w:hAnsi="Arial"/>
+              </w:rPr>
+            </w:r>
             <w:r>
               <w:rPr>
                 <w:rFonts w:ascii="Arial" w:hAnsi="Arial" w:eastAsia="Arial"/>
@@ -416,7 +440,11 @@
             <w:pPr>
               <w:spacing w:after="0"/>
             </w:pPr>
-            <w:r/>
+            <w:r>
+              <w:rPr>
+                <w:rFonts w:ascii="Arial" w:hAnsi="Arial"/>
+              </w:rPr>
+            </w:r>
             <w:r>
               <w:rPr>
                 <w:rFonts w:ascii="Arial" w:hAnsi="Arial" w:eastAsia="Arial"/>
@@ -436,7 +464,11 @@
             <w:pPr>
               <w:spacing w:after="0"/>
             </w:pPr>
-            <w:r/>
+            <w:r>
+              <w:rPr>
+                <w:rFonts w:ascii="Arial" w:hAnsi="Arial"/>
+              </w:rPr>
+            </w:r>
             <w:r>
               <w:rPr>
                 <w:rFonts w:ascii="Arial" w:hAnsi="Arial" w:eastAsia="Arial"/>
@@ -456,7 +488,11 @@
             <w:pPr>
               <w:spacing w:after="0"/>
             </w:pPr>
-            <w:r/>
+            <w:r>
+              <w:rPr>
+                <w:rFonts w:ascii="Arial" w:hAnsi="Arial"/>
+              </w:rPr>
+            </w:r>
             <w:r>
               <w:rPr>
                 <w:rFonts w:ascii="Arial" w:hAnsi="Arial" w:eastAsia="Arial"/>
@@ -478,7 +514,11 @@
             <w:pPr>
               <w:spacing w:after="0"/>
             </w:pPr>
-            <w:r/>
+            <w:r>
+              <w:rPr>
+                <w:rFonts w:ascii="Arial" w:hAnsi="Arial"/>
+              </w:rPr>
+            </w:r>
             <w:r>
               <w:rPr>
                 <w:rFonts w:ascii="Arial" w:hAnsi="Arial" w:eastAsia="Arial"/>
@@ -498,7 +538,11 @@
             <w:pPr>
               <w:spacing w:after="0"/>
             </w:pPr>
-            <w:r/>
+            <w:r>
+              <w:rPr>
+                <w:rFonts w:ascii="Arial" w:hAnsi="Arial"/>
+              </w:rPr>
+            </w:r>
             <w:r>
               <w:rPr>
                 <w:rFonts w:ascii="Arial" w:hAnsi="Arial" w:eastAsia="Arial"/>
@@ -518,7 +562,11 @@
             <w:pPr>
               <w:spacing w:after="0"/>
             </w:pPr>
-            <w:r/>
+            <w:r>
+              <w:rPr>
+                <w:rFonts w:ascii="Arial" w:hAnsi="Arial"/>
+              </w:rPr>
+            </w:r>
             <w:r>
               <w:rPr>
                 <w:rFonts w:ascii="Arial" w:hAnsi="Arial" w:eastAsia="Arial"/>
@@ -540,7 +588,11 @@
             <w:pPr>
               <w:spacing w:after="0"/>
             </w:pPr>
-            <w:r/>
+            <w:r>
+              <w:rPr>
+                <w:rFonts w:ascii="Arial" w:hAnsi="Arial"/>
+              </w:rPr>
+            </w:r>
             <w:r>
               <w:rPr>
                 <w:rFonts w:ascii="Arial" w:hAnsi="Arial" w:eastAsia="Arial"/>
@@ -560,7 +612,11 @@
             <w:pPr>
               <w:spacing w:after="0"/>
             </w:pPr>
-            <w:r/>
+            <w:r>
+              <w:rPr>
+                <w:rFonts w:ascii="Arial" w:hAnsi="Arial"/>
+              </w:rPr>
+            </w:r>
             <w:r>
               <w:rPr>
                 <w:rFonts w:ascii="Arial" w:hAnsi="Arial" w:eastAsia="Arial"/>
@@ -577,17 +633,11 @@
             <w:vAlign w:val="top"/>
           </w:tcPr>
           <w:p>
-            <w:pPr>
-              <w:spacing w:after="0"/>
-            </w:pPr>
-            <w:r/>
             <w:r>
               <w:rPr>
-                <w:rFonts w:ascii="Arial" w:hAnsi="Arial" w:eastAsia="Arial"/>
-                <w:b w:val="0"/>
-                <w:sz w:val="18"/>
+                <w:rFonts w:ascii="Arial" w:hAnsi="Arial"/>
               </w:rPr>
-              <w:t>แสดง expert reference + user upload แล้วคำนวณ accuracy</w:t>
+              <w:t>แสดง expert reference + user upload, เล่นพร้อมกัน, ซ้อน skeleton overlay, แล้วคำนวณ accuracy</w:t>
             </w:r>
           </w:p>
         </w:tc>
@@ -602,7 +652,11 @@
             <w:pPr>
               <w:spacing w:after="0"/>
             </w:pPr>
-            <w:r/>
+            <w:r>
+              <w:rPr>
+                <w:rFonts w:ascii="Arial" w:hAnsi="Arial"/>
+              </w:rPr>
+            </w:r>
             <w:r>
               <w:rPr>
                 <w:rFonts w:ascii="Arial" w:hAnsi="Arial" w:eastAsia="Arial"/>
@@ -622,7 +676,11 @@
             <w:pPr>
               <w:spacing w:after="0"/>
             </w:pPr>
-            <w:r/>
+            <w:r>
+              <w:rPr>
+                <w:rFonts w:ascii="Arial" w:hAnsi="Arial"/>
+              </w:rPr>
+            </w:r>
             <w:r>
               <w:rPr>
                 <w:rFonts w:ascii="Arial" w:hAnsi="Arial" w:eastAsia="Arial"/>
@@ -642,7 +700,11 @@
             <w:pPr>
               <w:spacing w:after="0"/>
             </w:pPr>
-            <w:r/>
+            <w:r>
+              <w:rPr>
+                <w:rFonts w:ascii="Arial" w:hAnsi="Arial"/>
+              </w:rPr>
+            </w:r>
             <w:r>
               <w:rPr>
                 <w:rFonts w:ascii="Arial" w:hAnsi="Arial" w:eastAsia="Arial"/>
@@ -650,6 +712,47 @@
                 <w:sz w:val="18"/>
               </w:rPr>
               <w:t>Core Data stack, seed exercise, ล้าง mock data เก่า</w:t>
+            </w:r>
+          </w:p>
+        </w:tc>
+      </w:tr>
+      <w:tr>
+        <w:tc>
+          <w:tcPr>
+            <w:tcW w:type="dxa" w:w="1656"/>
+          </w:tcPr>
+          <w:p>
+            <w:r>
+              <w:rPr>
+                <w:rFonts w:ascii="Arial" w:hAnsi="Arial"/>
+              </w:rPr>
+              <w:t>Shared Overlay</w:t>
+            </w:r>
+          </w:p>
+        </w:tc>
+        <w:tc>
+          <w:tcPr>
+            <w:tcW w:type="dxa" w:w="3096"/>
+          </w:tcPr>
+          <w:p>
+            <w:r>
+              <w:rPr>
+                <w:rFonts w:ascii="Arial" w:hAnsi="Arial"/>
+              </w:rPr>
+              <w:t>Designsystem.swift</w:t>
+            </w:r>
+          </w:p>
+        </w:tc>
+        <w:tc>
+          <w:tcPr>
+            <w:tcW w:type="dxa" w:w="4608"/>
+          </w:tcPr>
+          <w:p>
+            <w:r>
+              <w:rPr>
+                <w:rFonts w:ascii="Arial" w:hAnsi="Arial"/>
+              </w:rPr>
+              <w:t>UpperBodySkeletonOverlay วาดเฉพาะ upper-body joints เพื่อใช้ร่วมกันทั้ง Form และ Compare</w:t>
             </w:r>
           </w:p>
         </w:tc>
@@ -704,11 +807,7 @@
         <w:spacing w:after="60"/>
       </w:pPr>
       <w:r>
-        <w:rPr>
-          <w:rFonts w:ascii="Arial" w:hAnsi="Arial" w:eastAsia="Arial"/>
-          <w:sz w:val="21"/>
-        </w:rPr>
-        <w:t>AppNavigationState เก็บ selectedTab และข้อมูล reference video ที่จะส่งไป Compare</w:t>
+        <w:t>AppNavigationState เก็บ selectedTab, exercise ที่จะส่งไป Form Analysis, และข้อมูล reference video ที่จะส่งไป Compare</w:t>
       </w:r>
     </w:p>
     <w:p>
@@ -790,11 +889,7 @@
         <w:spacing w:after="60"/>
       </w:pPr>
       <w:r>
-        <w:rPr>
-          <w:rFonts w:ascii="Arial" w:hAnsi="Arial" w:eastAsia="Arial"/>
-          <w:sz w:val="21"/>
-        </w:rPr>
-        <w:t>ถ้าเป็น uploaded video จะสั่ง videoProcessor.play() เพื่ออ่าน frame จากวิดีโอแทนกล้อง</w:t>
+        <w:t>ถ้าเป็น uploaded video จะสั่ง videoProcessor.play() เพื่ออ่าน frame จากวิดีโอแทนกล้อง และแสดง skeleton เฉพาะ upper body บนวิดีโอ</w:t>
       </w:r>
     </w:p>
     <w:p>
@@ -860,6 +955,14 @@
     <w:p>
       <w:pPr>
         <w:pStyle w:val="ListNumber"/>
+      </w:pPr>
+      <w:r>
+        <w:t>UpperBodySkeletonOverlay เป็นตัวช่วยโชว์ skeleton บนวิดีโอทั้งสองฝั่ง เพื่อให้เห็นว่าแอปจับเฉพาะ upper body และไม่พึ่ง lower-body joints</w:t>
+      </w:r>
+    </w:p>
+    <w:p>
+      <w:pPr>
+        <w:pStyle w:val="ListNumber"/>
         <w:spacing w:after="60"/>
       </w:pPr>
       <w:r>
@@ -889,11 +992,7 @@
         <w:spacing w:after="60"/>
       </w:pPr>
       <w:r>
-        <w:rPr>
-          <w:rFonts w:ascii="Arial" w:hAnsi="Arial" w:eastAsia="Arial"/>
-          <w:sz w:val="21"/>
-        </w:rPr>
-        <w:t>เมื่อมีทั้ง expertVideoURL และ userVideoURL จะเรียก CompareAccuracyAnalyzer.analyze(...)</w:t>
+        <w:t>เมื่อมีทั้ง expertVideoURL และ userVideoURL จะเรียก CompareAccuracyAnalyzer.analyze(...) และปุ่ม play กลางจะเล่น expert/user พร้อมกัน</w:t>
       </w:r>
     </w:p>
     <w:p>
@@ -939,7 +1038,11 @@
             <w:pPr>
               <w:spacing w:after="0"/>
             </w:pPr>
-            <w:r/>
+            <w:r>
+              <w:rPr>
+                <w:rFonts w:ascii="Arial" w:hAnsi="Arial"/>
+              </w:rPr>
+            </w:r>
             <w:r>
               <w:rPr>
                 <w:rFonts w:ascii="Arial" w:hAnsi="Arial" w:eastAsia="Arial"/>
@@ -961,7 +1064,11 @@
             <w:pPr>
               <w:spacing w:after="0"/>
             </w:pPr>
-            <w:r/>
+            <w:r>
+              <w:rPr>
+                <w:rFonts w:ascii="Arial" w:hAnsi="Arial"/>
+              </w:rPr>
+            </w:r>
             <w:r>
               <w:rPr>
                 <w:rFonts w:ascii="Arial" w:hAnsi="Arial" w:eastAsia="Arial"/>
@@ -983,7 +1090,11 @@
             <w:pPr>
               <w:spacing w:after="0"/>
             </w:pPr>
-            <w:r/>
+            <w:r>
+              <w:rPr>
+                <w:rFonts w:ascii="Arial" w:hAnsi="Arial"/>
+              </w:rPr>
+            </w:r>
             <w:r>
               <w:rPr>
                 <w:rFonts w:ascii="Arial" w:hAnsi="Arial" w:eastAsia="Arial"/>
@@ -1006,7 +1117,11 @@
             <w:pPr>
               <w:spacing w:after="0"/>
             </w:pPr>
-            <w:r/>
+            <w:r>
+              <w:rPr>
+                <w:rFonts w:ascii="Arial" w:hAnsi="Arial"/>
+              </w:rPr>
+            </w:r>
             <w:r>
               <w:rPr>
                 <w:rFonts w:ascii="Arial" w:hAnsi="Arial" w:eastAsia="Arial"/>
@@ -1026,7 +1141,11 @@
             <w:pPr>
               <w:spacing w:after="0"/>
             </w:pPr>
-            <w:r/>
+            <w:r>
+              <w:rPr>
+                <w:rFonts w:ascii="Arial" w:hAnsi="Arial"/>
+              </w:rPr>
+            </w:r>
             <w:r>
               <w:rPr>
                 <w:rFonts w:ascii="Arial" w:hAnsi="Arial" w:eastAsia="Arial"/>
@@ -1046,7 +1165,11 @@
             <w:pPr>
               <w:spacing w:after="0"/>
             </w:pPr>
-            <w:r/>
+            <w:r>
+              <w:rPr>
+                <w:rFonts w:ascii="Arial" w:hAnsi="Arial"/>
+              </w:rPr>
+            </w:r>
             <w:r>
               <w:rPr>
                 <w:rFonts w:ascii="Arial" w:hAnsi="Arial" w:eastAsia="Arial"/>
@@ -1068,7 +1191,11 @@
             <w:pPr>
               <w:spacing w:after="0"/>
             </w:pPr>
-            <w:r/>
+            <w:r>
+              <w:rPr>
+                <w:rFonts w:ascii="Arial" w:hAnsi="Arial"/>
+              </w:rPr>
+            </w:r>
             <w:r>
               <w:rPr>
                 <w:rFonts w:ascii="Arial" w:hAnsi="Arial" w:eastAsia="Arial"/>
@@ -1088,7 +1215,11 @@
             <w:pPr>
               <w:spacing w:after="0"/>
             </w:pPr>
-            <w:r/>
+            <w:r>
+              <w:rPr>
+                <w:rFonts w:ascii="Arial" w:hAnsi="Arial"/>
+              </w:rPr>
+            </w:r>
             <w:r>
               <w:rPr>
                 <w:rFonts w:ascii="Arial" w:hAnsi="Arial" w:eastAsia="Arial"/>
@@ -1108,7 +1239,11 @@
             <w:pPr>
               <w:spacing w:after="0"/>
             </w:pPr>
-            <w:r/>
+            <w:r>
+              <w:rPr>
+                <w:rFonts w:ascii="Arial" w:hAnsi="Arial"/>
+              </w:rPr>
+            </w:r>
             <w:r>
               <w:rPr>
                 <w:rFonts w:ascii="Arial" w:hAnsi="Arial" w:eastAsia="Arial"/>
@@ -1130,7 +1265,11 @@
             <w:pPr>
               <w:spacing w:after="0"/>
             </w:pPr>
-            <w:r/>
+            <w:r>
+              <w:rPr>
+                <w:rFonts w:ascii="Arial" w:hAnsi="Arial"/>
+              </w:rPr>
+            </w:r>
             <w:r>
               <w:rPr>
                 <w:rFonts w:ascii="Arial" w:hAnsi="Arial" w:eastAsia="Arial"/>
@@ -1150,7 +1289,11 @@
             <w:pPr>
               <w:spacing w:after="0"/>
             </w:pPr>
-            <w:r/>
+            <w:r>
+              <w:rPr>
+                <w:rFonts w:ascii="Arial" w:hAnsi="Arial"/>
+              </w:rPr>
+            </w:r>
             <w:r>
               <w:rPr>
                 <w:rFonts w:ascii="Arial" w:hAnsi="Arial" w:eastAsia="Arial"/>
@@ -1170,7 +1313,11 @@
             <w:pPr>
               <w:spacing w:after="0"/>
             </w:pPr>
-            <w:r/>
+            <w:r>
+              <w:rPr>
+                <w:rFonts w:ascii="Arial" w:hAnsi="Arial"/>
+              </w:rPr>
+            </w:r>
             <w:r>
               <w:rPr>
                 <w:rFonts w:ascii="Arial" w:hAnsi="Arial" w:eastAsia="Arial"/>
@@ -1192,7 +1339,11 @@
             <w:pPr>
               <w:spacing w:after="0"/>
             </w:pPr>
-            <w:r/>
+            <w:r>
+              <w:rPr>
+                <w:rFonts w:ascii="Arial" w:hAnsi="Arial"/>
+              </w:rPr>
+            </w:r>
             <w:r>
               <w:rPr>
                 <w:rFonts w:ascii="Arial" w:hAnsi="Arial" w:eastAsia="Arial"/>
@@ -1212,7 +1363,11 @@
             <w:pPr>
               <w:spacing w:after="0"/>
             </w:pPr>
-            <w:r/>
+            <w:r>
+              <w:rPr>
+                <w:rFonts w:ascii="Arial" w:hAnsi="Arial"/>
+              </w:rPr>
+            </w:r>
             <w:r>
               <w:rPr>
                 <w:rFonts w:ascii="Arial" w:hAnsi="Arial" w:eastAsia="Arial"/>
@@ -1232,7 +1387,11 @@
             <w:pPr>
               <w:spacing w:after="0"/>
             </w:pPr>
-            <w:r/>
+            <w:r>
+              <w:rPr>
+                <w:rFonts w:ascii="Arial" w:hAnsi="Arial"/>
+              </w:rPr>
+            </w:r>
             <w:r>
               <w:rPr>
                 <w:rFonts w:ascii="Arial" w:hAnsi="Arial" w:eastAsia="Arial"/>
@@ -1254,7 +1413,11 @@
             <w:pPr>
               <w:spacing w:after="0"/>
             </w:pPr>
-            <w:r/>
+            <w:r>
+              <w:rPr>
+                <w:rFonts w:ascii="Arial" w:hAnsi="Arial"/>
+              </w:rPr>
+            </w:r>
             <w:r>
               <w:rPr>
                 <w:rFonts w:ascii="Arial" w:hAnsi="Arial" w:eastAsia="Arial"/>
@@ -1271,15 +1434,9 @@
             <w:vAlign w:val="top"/>
           </w:tcPr>
           <w:p>
-            <w:pPr>
-              <w:spacing w:after="0"/>
-            </w:pPr>
-            <w:r/>
             <w:r>
               <w:rPr>
-                <w:rFonts w:ascii="Arial" w:hAnsi="Arial" w:eastAsia="Arial"/>
-                <w:b w:val="0"/>
-                <w:sz w:val="18"/>
+                <w:rFonts w:ascii="Arial" w:hAnsi="Arial"/>
               </w:rPr>
               <w:t>ใช้ upper-body joints เท่านั้นในการนับ rep และประเมิน form</w:t>
             </w:r>
@@ -1291,17 +1448,11 @@
             <w:vAlign w:val="top"/>
           </w:tcPr>
           <w:p>
-            <w:pPr>
-              <w:spacing w:after="0"/>
-            </w:pPr>
-            <w:r/>
             <w:r>
               <w:rPr>
-                <w:rFonts w:ascii="Arial" w:hAnsi="Arial" w:eastAsia="Arial"/>
-                <w:b w:val="0"/>
-                <w:sz w:val="18"/>
+                <w:rFonts w:ascii="Arial" w:hAnsi="Arial"/>
               </w:rPr>
-              <w:t>ไม่ใช้ knees/ankles/feet แล้ว</w:t>
+              <w:t>ไม่ใช้ knees/ankles/feet ใน calculation หรือ scoring แล้ว</w:t>
             </w:r>
           </w:p>
         </w:tc>
@@ -1316,7 +1467,11 @@
             <w:pPr>
               <w:spacing w:after="0"/>
             </w:pPr>
-            <w:r/>
+            <w:r>
+              <w:rPr>
+                <w:rFonts w:ascii="Arial" w:hAnsi="Arial"/>
+              </w:rPr>
+            </w:r>
             <w:r>
               <w:rPr>
                 <w:rFonts w:ascii="Arial" w:hAnsi="Arial" w:eastAsia="Arial"/>
@@ -1336,7 +1491,11 @@
             <w:pPr>
               <w:spacing w:after="0"/>
             </w:pPr>
-            <w:r/>
+            <w:r>
+              <w:rPr>
+                <w:rFonts w:ascii="Arial" w:hAnsi="Arial"/>
+              </w:rPr>
+            </w:r>
             <w:r>
               <w:rPr>
                 <w:rFonts w:ascii="Arial" w:hAnsi="Arial" w:eastAsia="Arial"/>
@@ -1356,7 +1515,11 @@
             <w:pPr>
               <w:spacing w:after="0"/>
             </w:pPr>
-            <w:r/>
+            <w:r>
+              <w:rPr>
+                <w:rFonts w:ascii="Arial" w:hAnsi="Arial"/>
+              </w:rPr>
+            </w:r>
             <w:r>
               <w:rPr>
                 <w:rFonts w:ascii="Arial" w:hAnsi="Arial" w:eastAsia="Arial"/>
@@ -1364,6 +1527,47 @@
                 <w:sz w:val="18"/>
               </w:rPr>
               <w:t>ครึ่งตัวไม่พอสำหรับท่าขา จึงไม่วิเคราะห์</w:t>
+            </w:r>
+          </w:p>
+        </w:tc>
+      </w:tr>
+      <w:tr>
+        <w:tc>
+          <w:tcPr>
+            <w:tcW w:type="dxa" w:w="2232"/>
+          </w:tcPr>
+          <w:p>
+            <w:r>
+              <w:rPr>
+                <w:rFonts w:ascii="Arial" w:hAnsi="Arial"/>
+              </w:rPr>
+              <w:t>UpperBodySkeletonOverlay</w:t>
+            </w:r>
+          </w:p>
+        </w:tc>
+        <w:tc>
+          <w:tcPr>
+            <w:tcW w:type="dxa" w:w="3960"/>
+          </w:tcPr>
+          <w:p>
+            <w:r>
+              <w:rPr>
+                <w:rFonts w:ascii="Arial" w:hAnsi="Arial"/>
+              </w:rPr>
+              <w:t>รับ bodyParts จาก Vision แล้ววาดเฉพาะ nose, shoulders, elbows, wrists และ hips</w:t>
+            </w:r>
+          </w:p>
+        </w:tc>
+        <w:tc>
+          <w:tcPr>
+            <w:tcW w:type="dxa" w:w="3168"/>
+          </w:tcPr>
+          <w:p>
+            <w:r>
+              <w:rPr>
+                <w:rFonts w:ascii="Arial" w:hAnsi="Arial"/>
+              </w:rPr>
+              <w:t>เป็น overlay เพื่อ debug/อธิบายว่าแอปจับ upper body เท่านั้น ไม่ได้วิเคราะห์เท้า</w:t>
             </w:r>
           </w:p>
         </w:tc>
@@ -1492,11 +1696,7 @@
         <w:spacing w:after="60"/>
       </w:pPr>
       <w:r>
-        <w:rPr>
-          <w:rFonts w:ascii="Arial" w:hAnsi="Arial" w:eastAsia="Arial"/>
-          <w:sz w:val="21"/>
-        </w:rPr>
-        <w:t>CameraViewport เลือกแสดง live camera, uploaded video, หรือ skeleton overlay ตามสถานะ</w:t>
+        <w:t>CameraViewport เลือกแสดง live camera, uploaded video, หรือ guide skeleton และซ้อน UpperBodySkeletonOverlay ตอนมี pose จริง โดยไม่วาด knee/ankle/foot</w:t>
       </w:r>
     </w:p>
     <w:p>
@@ -1530,7 +1730,11 @@
             <w:pPr>
               <w:spacing w:after="0"/>
             </w:pPr>
-            <w:r/>
+            <w:r>
+              <w:rPr>
+                <w:rFonts w:ascii="Arial" w:hAnsi="Arial"/>
+              </w:rPr>
+            </w:r>
             <w:r>
               <w:rPr>
                 <w:rFonts w:ascii="Arial" w:hAnsi="Arial" w:eastAsia="Arial"/>
@@ -1552,7 +1756,11 @@
             <w:pPr>
               <w:spacing w:after="0"/>
             </w:pPr>
-            <w:r/>
+            <w:r>
+              <w:rPr>
+                <w:rFonts w:ascii="Arial" w:hAnsi="Arial"/>
+              </w:rPr>
+            </w:r>
             <w:r>
               <w:rPr>
                 <w:rFonts w:ascii="Arial" w:hAnsi="Arial" w:eastAsia="Arial"/>
@@ -1574,7 +1782,11 @@
             <w:pPr>
               <w:spacing w:after="0"/>
             </w:pPr>
-            <w:r/>
+            <w:r>
+              <w:rPr>
+                <w:rFonts w:ascii="Arial" w:hAnsi="Arial"/>
+              </w:rPr>
+            </w:r>
             <w:r>
               <w:rPr>
                 <w:rFonts w:ascii="Arial" w:hAnsi="Arial" w:eastAsia="Arial"/>
@@ -1597,7 +1809,11 @@
             <w:pPr>
               <w:spacing w:after="0"/>
             </w:pPr>
-            <w:r/>
+            <w:r>
+              <w:rPr>
+                <w:rFonts w:ascii="Arial" w:hAnsi="Arial"/>
+              </w:rPr>
+            </w:r>
             <w:r>
               <w:rPr>
                 <w:rFonts w:ascii="Arial" w:hAnsi="Arial" w:eastAsia="Arial"/>
@@ -1617,7 +1833,11 @@
             <w:pPr>
               <w:spacing w:after="0"/>
             </w:pPr>
-            <w:r/>
+            <w:r>
+              <w:rPr>
+                <w:rFonts w:ascii="Arial" w:hAnsi="Arial"/>
+              </w:rPr>
+            </w:r>
             <w:r>
               <w:rPr>
                 <w:rFonts w:ascii="Arial" w:hAnsi="Arial" w:eastAsia="Arial"/>
@@ -1637,7 +1857,11 @@
             <w:pPr>
               <w:spacing w:after="0"/>
             </w:pPr>
-            <w:r/>
+            <w:r>
+              <w:rPr>
+                <w:rFonts w:ascii="Arial" w:hAnsi="Arial"/>
+              </w:rPr>
+            </w:r>
             <w:r>
               <w:rPr>
                 <w:rFonts w:ascii="Arial" w:hAnsi="Arial" w:eastAsia="Arial"/>
@@ -1659,7 +1883,11 @@
             <w:pPr>
               <w:spacing w:after="0"/>
             </w:pPr>
-            <w:r/>
+            <w:r>
+              <w:rPr>
+                <w:rFonts w:ascii="Arial" w:hAnsi="Arial"/>
+              </w:rPr>
+            </w:r>
             <w:r>
               <w:rPr>
                 <w:rFonts w:ascii="Arial" w:hAnsi="Arial" w:eastAsia="Arial"/>
@@ -1679,7 +1907,11 @@
             <w:pPr>
               <w:spacing w:after="0"/>
             </w:pPr>
-            <w:r/>
+            <w:r>
+              <w:rPr>
+                <w:rFonts w:ascii="Arial" w:hAnsi="Arial"/>
+              </w:rPr>
+            </w:r>
             <w:r>
               <w:rPr>
                 <w:rFonts w:ascii="Arial" w:hAnsi="Arial" w:eastAsia="Arial"/>
@@ -1699,7 +1931,11 @@
             <w:pPr>
               <w:spacing w:after="0"/>
             </w:pPr>
-            <w:r/>
+            <w:r>
+              <w:rPr>
+                <w:rFonts w:ascii="Arial" w:hAnsi="Arial"/>
+              </w:rPr>
+            </w:r>
             <w:r>
               <w:rPr>
                 <w:rFonts w:ascii="Arial" w:hAnsi="Arial" w:eastAsia="Arial"/>
@@ -1721,7 +1957,11 @@
             <w:pPr>
               <w:spacing w:after="0"/>
             </w:pPr>
-            <w:r/>
+            <w:r>
+              <w:rPr>
+                <w:rFonts w:ascii="Arial" w:hAnsi="Arial"/>
+              </w:rPr>
+            </w:r>
             <w:r>
               <w:rPr>
                 <w:rFonts w:ascii="Arial" w:hAnsi="Arial" w:eastAsia="Arial"/>
@@ -1741,7 +1981,11 @@
             <w:pPr>
               <w:spacing w:after="0"/>
             </w:pPr>
-            <w:r/>
+            <w:r>
+              <w:rPr>
+                <w:rFonts w:ascii="Arial" w:hAnsi="Arial"/>
+              </w:rPr>
+            </w:r>
             <w:r>
               <w:rPr>
                 <w:rFonts w:ascii="Arial" w:hAnsi="Arial" w:eastAsia="Arial"/>
@@ -1761,7 +2005,11 @@
             <w:pPr>
               <w:spacing w:after="0"/>
             </w:pPr>
-            <w:r/>
+            <w:r>
+              <w:rPr>
+                <w:rFonts w:ascii="Arial" w:hAnsi="Arial"/>
+              </w:rPr>
+            </w:r>
             <w:r>
               <w:rPr>
                 <w:rFonts w:ascii="Arial" w:hAnsi="Arial" w:eastAsia="Arial"/>
@@ -1783,7 +2031,11 @@
             <w:pPr>
               <w:spacing w:after="0"/>
             </w:pPr>
-            <w:r/>
+            <w:r>
+              <w:rPr>
+                <w:rFonts w:ascii="Arial" w:hAnsi="Arial"/>
+              </w:rPr>
+            </w:r>
             <w:r>
               <w:rPr>
                 <w:rFonts w:ascii="Arial" w:hAnsi="Arial" w:eastAsia="Arial"/>
@@ -1803,7 +2055,11 @@
             <w:pPr>
               <w:spacing w:after="0"/>
             </w:pPr>
-            <w:r/>
+            <w:r>
+              <w:rPr>
+                <w:rFonts w:ascii="Arial" w:hAnsi="Arial"/>
+              </w:rPr>
+            </w:r>
             <w:r>
               <w:rPr>
                 <w:rFonts w:ascii="Arial" w:hAnsi="Arial" w:eastAsia="Arial"/>
@@ -1823,7 +2079,11 @@
             <w:pPr>
               <w:spacing w:after="0"/>
             </w:pPr>
-            <w:r/>
+            <w:r>
+              <w:rPr>
+                <w:rFonts w:ascii="Arial" w:hAnsi="Arial"/>
+              </w:rPr>
+            </w:r>
             <w:r>
               <w:rPr>
                 <w:rFonts w:ascii="Arial" w:hAnsi="Arial" w:eastAsia="Arial"/>
@@ -1946,11 +2206,7 @@
         <w:spacing w:after="60"/>
       </w:pPr>
       <w:r>
-        <w:rPr>
-          <w:rFonts w:ascii="Arial" w:hAnsi="Arial" w:eastAsia="Arial"/>
-          <w:sz w:val="21"/>
-        </w:rPr>
-        <w:t>runAccuracyAnalysisIfPossible() จะทำงานเมื่อมีทั้ง expertVideoURL และ userVideoURL</w:t>
+        <w:t>runAccuracyAnalysisIfPossible() จะทำงานเมื่อมีทั้ง expertVideoURL และ userVideoURL แล้วคำนวณคะแนนจาก upper-body pose เท่านั้น</w:t>
       </w:r>
     </w:p>
     <w:tbl>
@@ -1975,7 +2231,11 @@
             <w:pPr>
               <w:spacing w:after="0"/>
             </w:pPr>
-            <w:r/>
+            <w:r>
+              <w:rPr>
+                <w:rFonts w:ascii="Arial" w:hAnsi="Arial"/>
+              </w:rPr>
+            </w:r>
             <w:r>
               <w:rPr>
                 <w:rFonts w:ascii="Arial" w:hAnsi="Arial" w:eastAsia="Arial"/>
@@ -1997,7 +2257,11 @@
             <w:pPr>
               <w:spacing w:after="0"/>
             </w:pPr>
-            <w:r/>
+            <w:r>
+              <w:rPr>
+                <w:rFonts w:ascii="Arial" w:hAnsi="Arial"/>
+              </w:rPr>
+            </w:r>
             <w:r>
               <w:rPr>
                 <w:rFonts w:ascii="Arial" w:hAnsi="Arial" w:eastAsia="Arial"/>
@@ -2020,7 +2284,11 @@
             <w:pPr>
               <w:spacing w:after="0"/>
             </w:pPr>
-            <w:r/>
+            <w:r>
+              <w:rPr>
+                <w:rFonts w:ascii="Arial" w:hAnsi="Arial"/>
+              </w:rPr>
+            </w:r>
             <w:r>
               <w:rPr>
                 <w:rFonts w:ascii="Arial" w:hAnsi="Arial" w:eastAsia="Arial"/>
@@ -2040,7 +2308,11 @@
             <w:pPr>
               <w:spacing w:after="0"/>
             </w:pPr>
-            <w:r/>
+            <w:r>
+              <w:rPr>
+                <w:rFonts w:ascii="Arial" w:hAnsi="Arial"/>
+              </w:rPr>
+            </w:r>
             <w:r>
               <w:rPr>
                 <w:rFonts w:ascii="Arial" w:hAnsi="Arial" w:eastAsia="Arial"/>
@@ -2062,7 +2334,11 @@
             <w:pPr>
               <w:spacing w:after="0"/>
             </w:pPr>
-            <w:r/>
+            <w:r>
+              <w:rPr>
+                <w:rFonts w:ascii="Arial" w:hAnsi="Arial"/>
+              </w:rPr>
+            </w:r>
             <w:r>
               <w:rPr>
                 <w:rFonts w:ascii="Arial" w:hAnsi="Arial" w:eastAsia="Arial"/>
@@ -2082,7 +2358,11 @@
             <w:pPr>
               <w:spacing w:after="0"/>
             </w:pPr>
-            <w:r/>
+            <w:r>
+              <w:rPr>
+                <w:rFonts w:ascii="Arial" w:hAnsi="Arial"/>
+              </w:rPr>
+            </w:r>
             <w:r>
               <w:rPr>
                 <w:rFonts w:ascii="Arial" w:hAnsi="Arial" w:eastAsia="Arial"/>
@@ -2104,7 +2384,11 @@
             <w:pPr>
               <w:spacing w:after="0"/>
             </w:pPr>
-            <w:r/>
+            <w:r>
+              <w:rPr>
+                <w:rFonts w:ascii="Arial" w:hAnsi="Arial"/>
+              </w:rPr>
+            </w:r>
             <w:r>
               <w:rPr>
                 <w:rFonts w:ascii="Arial" w:hAnsi="Arial" w:eastAsia="Arial"/>
@@ -2124,7 +2408,11 @@
             <w:pPr>
               <w:spacing w:after="0"/>
             </w:pPr>
-            <w:r/>
+            <w:r>
+              <w:rPr>
+                <w:rFonts w:ascii="Arial" w:hAnsi="Arial"/>
+              </w:rPr>
+            </w:r>
             <w:r>
               <w:rPr>
                 <w:rFonts w:ascii="Arial" w:hAnsi="Arial" w:eastAsia="Arial"/>
@@ -2146,7 +2434,11 @@
             <w:pPr>
               <w:spacing w:after="0"/>
             </w:pPr>
-            <w:r/>
+            <w:r>
+              <w:rPr>
+                <w:rFonts w:ascii="Arial" w:hAnsi="Arial"/>
+              </w:rPr>
+            </w:r>
             <w:r>
               <w:rPr>
                 <w:rFonts w:ascii="Arial" w:hAnsi="Arial" w:eastAsia="Arial"/>
@@ -2166,7 +2458,11 @@
             <w:pPr>
               <w:spacing w:after="0"/>
             </w:pPr>
-            <w:r/>
+            <w:r>
+              <w:rPr>
+                <w:rFonts w:ascii="Arial" w:hAnsi="Arial"/>
+              </w:rPr>
+            </w:r>
             <w:r>
               <w:rPr>
                 <w:rFonts w:ascii="Arial" w:hAnsi="Arial" w:eastAsia="Arial"/>
@@ -2188,7 +2484,11 @@
             <w:pPr>
               <w:spacing w:after="0"/>
             </w:pPr>
-            <w:r/>
+            <w:r>
+              <w:rPr>
+                <w:rFonts w:ascii="Arial" w:hAnsi="Arial"/>
+              </w:rPr>
+            </w:r>
             <w:r>
               <w:rPr>
                 <w:rFonts w:ascii="Arial" w:hAnsi="Arial" w:eastAsia="Arial"/>
@@ -2208,7 +2508,11 @@
             <w:pPr>
               <w:spacing w:after="0"/>
             </w:pPr>
-            <w:r/>
+            <w:r>
+              <w:rPr>
+                <w:rFonts w:ascii="Arial" w:hAnsi="Arial"/>
+              </w:rPr>
+            </w:r>
             <w:r>
               <w:rPr>
                 <w:rFonts w:ascii="Arial" w:hAnsi="Arial" w:eastAsia="Arial"/>
@@ -2230,7 +2534,11 @@
             <w:pPr>
               <w:spacing w:after="0"/>
             </w:pPr>
-            <w:r/>
+            <w:r>
+              <w:rPr>
+                <w:rFonts w:ascii="Arial" w:hAnsi="Arial"/>
+              </w:rPr>
+            </w:r>
             <w:r>
               <w:rPr>
                 <w:rFonts w:ascii="Arial" w:hAnsi="Arial" w:eastAsia="Arial"/>
@@ -2250,7 +2558,11 @@
             <w:pPr>
               <w:spacing w:after="0"/>
             </w:pPr>
-            <w:r/>
+            <w:r>
+              <w:rPr>
+                <w:rFonts w:ascii="Arial" w:hAnsi="Arial"/>
+              </w:rPr>
+            </w:r>
             <w:r>
               <w:rPr>
                 <w:rFonts w:ascii="Arial" w:hAnsi="Arial" w:eastAsia="Arial"/>
@@ -2272,7 +2584,11 @@
             <w:pPr>
               <w:spacing w:after="0"/>
             </w:pPr>
-            <w:r/>
+            <w:r>
+              <w:rPr>
+                <w:rFonts w:ascii="Arial" w:hAnsi="Arial"/>
+              </w:rPr>
+            </w:r>
             <w:r>
               <w:rPr>
                 <w:rFonts w:ascii="Arial" w:hAnsi="Arial" w:eastAsia="Arial"/>
@@ -2292,7 +2608,11 @@
             <w:pPr>
               <w:spacing w:after="0"/>
             </w:pPr>
-            <w:r/>
+            <w:r>
+              <w:rPr>
+                <w:rFonts w:ascii="Arial" w:hAnsi="Arial"/>
+              </w:rPr>
+            </w:r>
             <w:r>
               <w:rPr>
                 <w:rFonts w:ascii="Arial" w:hAnsi="Arial" w:eastAsia="Arial"/>
@@ -2300,6 +2620,90 @@
                 <w:sz w:val="18"/>
               </w:rPr>
               <w:t>clamp ให้อยู่ 0 ถึง 100 แล้วแสดงใน Form Accuracy</w:t>
+            </w:r>
+          </w:p>
+        </w:tc>
+      </w:tr>
+      <w:tr>
+        <w:tc>
+          <w:tcPr>
+            <w:tcW w:type="dxa" w:w="3240"/>
+          </w:tcPr>
+          <w:p>
+            <w:r>
+              <w:rPr>
+                <w:rFonts w:ascii="Arial" w:hAnsi="Arial"/>
+              </w:rPr>
+              <w:t>alignedComparablePairs</w:t>
+            </w:r>
+          </w:p>
+        </w:tc>
+        <w:tc>
+          <w:tcPr>
+            <w:tcW w:type="dxa" w:w="5832"/>
+          </w:tcPr>
+          <w:p>
+            <w:r>
+              <w:rPr>
+                <w:rFonts w:ascii="Arial" w:hAnsi="Arial"/>
+              </w:rPr>
+              <w:t>เทียบ user sample กับ reference frame ใกล้เคียง index -1, index, index +1 เพื่อลดผลเสียจาก timing ที่เหลื่อมเล็กน้อย</w:t>
+            </w:r>
+          </w:p>
+        </w:tc>
+      </w:tr>
+      <w:tr>
+        <w:tc>
+          <w:tcPr>
+            <w:tcW w:type="dxa" w:w="3240"/>
+          </w:tcPr>
+          <w:p>
+            <w:r>
+              <w:rPr>
+                <w:rFonts w:ascii="Arial" w:hAnsi="Arial"/>
+              </w:rPr>
+              <w:t>mirroredUser comparison</w:t>
+            </w:r>
+          </w:p>
+        </w:tc>
+        <w:tc>
+          <w:tcPr>
+            <w:tcW w:type="dxa" w:w="5832"/>
+          </w:tcPr>
+          <w:p>
+            <w:r>
+              <w:rPr>
+                <w:rFonts w:ascii="Arial" w:hAnsi="Arial"/>
+              </w:rPr>
+              <w:t>คำนวณทั้งแบบ left-left/right-right และแบบสลับซ้ายขวา แล้วเลือก deviation ที่ต่ำกว่า เพื่อรองรับกล้องหน้าที่ mirror ภาพ</w:t>
+            </w:r>
+          </w:p>
+        </w:tc>
+      </w:tr>
+      <w:tr>
+        <w:tc>
+          <w:tcPr>
+            <w:tcW w:type="dxa" w:w="3240"/>
+          </w:tcPr>
+          <w:p>
+            <w:r>
+              <w:rPr>
+                <w:rFonts w:ascii="Arial" w:hAnsi="Arial"/>
+              </w:rPr>
+              <w:t>VideoPoseOverlayModel</w:t>
+            </w:r>
+          </w:p>
+        </w:tc>
+        <w:tc>
+          <w:tcPr>
+            <w:tcW w:type="dxa" w:w="5832"/>
+          </w:tcPr>
+          <w:p>
+            <w:r>
+              <w:rPr>
+                <w:rFonts w:ascii="Arial" w:hAnsi="Arial"/>
+              </w:rPr>
+              <w:t>อ่าน frame จาก AVPlayer แล้วเรียก VNDetectHumanBodyPoseRequest เพื่อวาด skeleton บน Expert Reference และ User Recording</w:t>
             </w:r>
           </w:p>
         </w:tc>
@@ -2422,7 +2826,11 @@
             <w:pPr>
               <w:spacing w:after="0"/>
             </w:pPr>
-            <w:r/>
+            <w:r>
+              <w:rPr>
+                <w:rFonts w:ascii="Arial" w:hAnsi="Arial"/>
+              </w:rPr>
+            </w:r>
             <w:r>
               <w:rPr>
                 <w:rFonts w:ascii="Arial" w:hAnsi="Arial" w:eastAsia="Arial"/>
@@ -2444,7 +2852,11 @@
             <w:pPr>
               <w:spacing w:after="0"/>
             </w:pPr>
-            <w:r/>
+            <w:r>
+              <w:rPr>
+                <w:rFonts w:ascii="Arial" w:hAnsi="Arial"/>
+              </w:rPr>
+            </w:r>
             <w:r>
               <w:rPr>
                 <w:rFonts w:ascii="Arial" w:hAnsi="Arial" w:eastAsia="Arial"/>
@@ -2467,7 +2879,11 @@
             <w:pPr>
               <w:spacing w:after="0"/>
             </w:pPr>
-            <w:r/>
+            <w:r>
+              <w:rPr>
+                <w:rFonts w:ascii="Arial" w:hAnsi="Arial"/>
+              </w:rPr>
+            </w:r>
             <w:r>
               <w:rPr>
                 <w:rFonts w:ascii="Arial" w:hAnsi="Arial" w:eastAsia="Arial"/>
@@ -2487,7 +2903,11 @@
             <w:pPr>
               <w:spacing w:after="0"/>
             </w:pPr>
-            <w:r/>
+            <w:r>
+              <w:rPr>
+                <w:rFonts w:ascii="Arial" w:hAnsi="Arial"/>
+              </w:rPr>
+            </w:r>
             <w:r>
               <w:rPr>
                 <w:rFonts w:ascii="Arial" w:hAnsi="Arial" w:eastAsia="Arial"/>
@@ -2509,7 +2929,11 @@
             <w:pPr>
               <w:spacing w:after="0"/>
             </w:pPr>
-            <w:r/>
+            <w:r>
+              <w:rPr>
+                <w:rFonts w:ascii="Arial" w:hAnsi="Arial"/>
+              </w:rPr>
+            </w:r>
             <w:r>
               <w:rPr>
                 <w:rFonts w:ascii="Arial" w:hAnsi="Arial" w:eastAsia="Arial"/>
@@ -2529,7 +2953,11 @@
             <w:pPr>
               <w:spacing w:after="0"/>
             </w:pPr>
-            <w:r/>
+            <w:r>
+              <w:rPr>
+                <w:rFonts w:ascii="Arial" w:hAnsi="Arial"/>
+              </w:rPr>
+            </w:r>
             <w:r>
               <w:rPr>
                 <w:rFonts w:ascii="Arial" w:hAnsi="Arial" w:eastAsia="Arial"/>
@@ -2551,7 +2979,11 @@
             <w:pPr>
               <w:spacing w:after="0"/>
             </w:pPr>
-            <w:r/>
+            <w:r>
+              <w:rPr>
+                <w:rFonts w:ascii="Arial" w:hAnsi="Arial"/>
+              </w:rPr>
+            </w:r>
             <w:r>
               <w:rPr>
                 <w:rFonts w:ascii="Arial" w:hAnsi="Arial" w:eastAsia="Arial"/>
@@ -2571,7 +3003,11 @@
             <w:pPr>
               <w:spacing w:after="0"/>
             </w:pPr>
-            <w:r/>
+            <w:r>
+              <w:rPr>
+                <w:rFonts w:ascii="Arial" w:hAnsi="Arial"/>
+              </w:rPr>
+            </w:r>
             <w:r>
               <w:rPr>
                 <w:rFonts w:ascii="Arial" w:hAnsi="Arial" w:eastAsia="Arial"/>
@@ -2593,7 +3029,11 @@
             <w:pPr>
               <w:spacing w:after="0"/>
             </w:pPr>
-            <w:r/>
+            <w:r>
+              <w:rPr>
+                <w:rFonts w:ascii="Arial" w:hAnsi="Arial"/>
+              </w:rPr>
+            </w:r>
             <w:r>
               <w:rPr>
                 <w:rFonts w:ascii="Arial" w:hAnsi="Arial" w:eastAsia="Arial"/>
@@ -2613,7 +3053,11 @@
             <w:pPr>
               <w:spacing w:after="0"/>
             </w:pPr>
-            <w:r/>
+            <w:r>
+              <w:rPr>
+                <w:rFonts w:ascii="Arial" w:hAnsi="Arial"/>
+              </w:rPr>
+            </w:r>
             <w:r>
               <w:rPr>
                 <w:rFonts w:ascii="Arial" w:hAnsi="Arial" w:eastAsia="Arial"/>
@@ -2635,7 +3079,11 @@
             <w:pPr>
               <w:spacing w:after="0"/>
             </w:pPr>
-            <w:r/>
+            <w:r>
+              <w:rPr>
+                <w:rFonts w:ascii="Arial" w:hAnsi="Arial"/>
+              </w:rPr>
+            </w:r>
             <w:r>
               <w:rPr>
                 <w:rFonts w:ascii="Arial" w:hAnsi="Arial" w:eastAsia="Arial"/>
@@ -2655,7 +3103,11 @@
             <w:pPr>
               <w:spacing w:after="0"/>
             </w:pPr>
-            <w:r/>
+            <w:r>
+              <w:rPr>
+                <w:rFonts w:ascii="Arial" w:hAnsi="Arial"/>
+              </w:rPr>
+            </w:r>
             <w:r>
               <w:rPr>
                 <w:rFonts w:ascii="Arial" w:hAnsi="Arial" w:eastAsia="Arial"/>
@@ -2677,7 +3129,11 @@
             <w:pPr>
               <w:spacing w:after="0"/>
             </w:pPr>
-            <w:r/>
+            <w:r>
+              <w:rPr>
+                <w:rFonts w:ascii="Arial" w:hAnsi="Arial"/>
+              </w:rPr>
+            </w:r>
             <w:r>
               <w:rPr>
                 <w:rFonts w:ascii="Arial" w:hAnsi="Arial" w:eastAsia="Arial"/>
@@ -2697,7 +3153,11 @@
             <w:pPr>
               <w:spacing w:after="0"/>
             </w:pPr>
-            <w:r/>
+            <w:r>
+              <w:rPr>
+                <w:rFonts w:ascii="Arial" w:hAnsi="Arial"/>
+              </w:rPr>
+            </w:r>
             <w:r>
               <w:rPr>
                 <w:rFonts w:ascii="Arial" w:hAnsi="Arial" w:eastAsia="Arial"/>
@@ -2719,7 +3179,11 @@
             <w:pPr>
               <w:spacing w:after="0"/>
             </w:pPr>
-            <w:r/>
+            <w:r>
+              <w:rPr>
+                <w:rFonts w:ascii="Arial" w:hAnsi="Arial"/>
+              </w:rPr>
+            </w:r>
             <w:r>
               <w:rPr>
                 <w:rFonts w:ascii="Arial" w:hAnsi="Arial" w:eastAsia="Arial"/>
@@ -2739,7 +3203,11 @@
             <w:pPr>
               <w:spacing w:after="0"/>
             </w:pPr>
-            <w:r/>
+            <w:r>
+              <w:rPr>
+                <w:rFonts w:ascii="Arial" w:hAnsi="Arial"/>
+              </w:rPr>
+            </w:r>
             <w:r>
               <w:rPr>
                 <w:rFonts w:ascii="Arial" w:hAnsi="Arial" w:eastAsia="Arial"/>
@@ -2761,7 +3229,11 @@
             <w:pPr>
               <w:spacing w:after="0"/>
             </w:pPr>
-            <w:r/>
+            <w:r>
+              <w:rPr>
+                <w:rFonts w:ascii="Arial" w:hAnsi="Arial"/>
+              </w:rPr>
+            </w:r>
             <w:r>
               <w:rPr>
                 <w:rFonts w:ascii="Arial" w:hAnsi="Arial" w:eastAsia="Arial"/>
@@ -2781,7 +3253,11 @@
             <w:pPr>
               <w:spacing w:after="0"/>
             </w:pPr>
-            <w:r/>
+            <w:r>
+              <w:rPr>
+                <w:rFonts w:ascii="Arial" w:hAnsi="Arial"/>
+              </w:rPr>
+            </w:r>
             <w:r>
               <w:rPr>
                 <w:rFonts w:ascii="Arial" w:hAnsi="Arial" w:eastAsia="Arial"/>
@@ -2803,7 +3279,11 @@
             <w:pPr>
               <w:spacing w:after="0"/>
             </w:pPr>
-            <w:r/>
+            <w:r>
+              <w:rPr>
+                <w:rFonts w:ascii="Arial" w:hAnsi="Arial"/>
+              </w:rPr>
+            </w:r>
             <w:r>
               <w:rPr>
                 <w:rFonts w:ascii="Arial" w:hAnsi="Arial" w:eastAsia="Arial"/>
@@ -2823,7 +3303,11 @@
             <w:pPr>
               <w:spacing w:after="0"/>
             </w:pPr>
-            <w:r/>
+            <w:r>
+              <w:rPr>
+                <w:rFonts w:ascii="Arial" w:hAnsi="Arial"/>
+              </w:rPr>
+            </w:r>
             <w:r>
               <w:rPr>
                 <w:rFonts w:ascii="Arial" w:hAnsi="Arial" w:eastAsia="Arial"/>
@@ -2845,7 +3329,11 @@
             <w:pPr>
               <w:spacing w:after="0"/>
             </w:pPr>
-            <w:r/>
+            <w:r>
+              <w:rPr>
+                <w:rFonts w:ascii="Arial" w:hAnsi="Arial"/>
+              </w:rPr>
+            </w:r>
             <w:r>
               <w:rPr>
                 <w:rFonts w:ascii="Arial" w:hAnsi="Arial" w:eastAsia="Arial"/>
@@ -2865,7 +3353,11 @@
             <w:pPr>
               <w:spacing w:after="0"/>
             </w:pPr>
-            <w:r/>
+            <w:r>
+              <w:rPr>
+                <w:rFonts w:ascii="Arial" w:hAnsi="Arial"/>
+              </w:rPr>
+            </w:r>
             <w:r>
               <w:rPr>
                 <w:rFonts w:ascii="Arial" w:hAnsi="Arial" w:eastAsia="Arial"/>
@@ -2873,6 +3365,90 @@
                 <w:sz w:val="18"/>
               </w:rPr>
               <w:t>CompareAccuracyAnalyzer.swift</w:t>
+            </w:r>
+          </w:p>
+        </w:tc>
+      </w:tr>
+      <w:tr>
+        <w:tc>
+          <w:tcPr>
+            <w:tcW w:type="dxa" w:w="3312"/>
+          </w:tcPr>
+          <w:p>
+            <w:r>
+              <w:rPr>
+                <w:rFonts w:ascii="Arial" w:hAnsi="Arial"/>
+              </w:rPr>
+              <w:t>ทำไม skeleton ไม่แสดงเท้า?</w:t>
+            </w:r>
+          </w:p>
+        </w:tc>
+        <w:tc>
+          <w:tcPr>
+            <w:tcW w:type="dxa" w:w="5760"/>
+          </w:tcPr>
+          <w:p>
+            <w:r>
+              <w:rPr>
+                <w:rFonts w:ascii="Arial" w:hAnsi="Arial"/>
+              </w:rPr>
+              <w:t>เพราะระบบนี้ออกแบบเป็น half-body tracking จึงวาดและใช้เฉพาะ nose/shoulder/elbow/wrist และ hip สำหรับ framing เท่านั้น</w:t>
+            </w:r>
+          </w:p>
+        </w:tc>
+      </w:tr>
+      <w:tr>
+        <w:tc>
+          <w:tcPr>
+            <w:tcW w:type="dxa" w:w="3312"/>
+          </w:tcPr>
+          <w:p>
+            <w:r>
+              <w:rPr>
+                <w:rFonts w:ascii="Arial" w:hAnsi="Arial"/>
+              </w:rPr>
+              <w:t>ทำไมคะแนน Compare ก่อนหน้านี้อาจเพี้ยน?</w:t>
+            </w:r>
+          </w:p>
+        </w:tc>
+        <w:tc>
+          <w:tcPr>
+            <w:tcW w:type="dxa" w:w="5760"/>
+          </w:tcPr>
+          <w:p>
+            <w:r>
+              <w:rPr>
+                <w:rFonts w:ascii="Arial" w:hAnsi="Arial"/>
+              </w:rPr>
+              <w:t>ถ้าวิดีโอผู้ใช้มาจากกล้องหน้า ภาพซ้ายขวาอาจ mirror กับ reference และจังหวะเริ่มอาจเหลื่อม ตอนนี้จึงเทียบทั้งแบบ mirror/non-mirror และเทียบ reference frame ใกล้เคียง</w:t>
+            </w:r>
+          </w:p>
+        </w:tc>
+      </w:tr>
+      <w:tr>
+        <w:tc>
+          <w:tcPr>
+            <w:tcW w:type="dxa" w:w="3312"/>
+          </w:tcPr>
+          <w:p>
+            <w:r>
+              <w:rPr>
+                <w:rFonts w:ascii="Arial" w:hAnsi="Arial"/>
+              </w:rPr>
+              <w:t>Expert กับ user video เล่นพร้อมกันตรงไหน?</w:t>
+            </w:r>
+          </w:p>
+        </w:tc>
+        <w:tc>
+          <w:tcPr>
+            <w:tcW w:type="dxa" w:w="5760"/>
+          </w:tcPr>
+          <w:p>
+            <w:r>
+              <w:rPr>
+                <w:rFonts w:ascii="Arial" w:hAnsi="Arial"/>
+              </w:rPr>
+              <w:t>SharedPlaybackControls ใน Compareview.swift ควบคุม expertPlayer และ userPlayer พร้อมกัน และ reset ทั้งคู่ไป 0:00 หลัง upload</w:t>
             </w:r>
           </w:p>
         </w:tc>
@@ -2910,7 +3486,11 @@
             <w:pPr>
               <w:spacing w:after="0"/>
             </w:pPr>
-            <w:r/>
+            <w:r>
+              <w:rPr>
+                <w:rFonts w:ascii="Arial" w:hAnsi="Arial"/>
+              </w:rPr>
+            </w:r>
             <w:r>
               <w:rPr>
                 <w:rFonts w:ascii="Arial" w:hAnsi="Arial" w:eastAsia="Arial"/>
@@ -2932,7 +3512,11 @@
             <w:pPr>
               <w:spacing w:after="0"/>
             </w:pPr>
-            <w:r/>
+            <w:r>
+              <w:rPr>
+                <w:rFonts w:ascii="Arial" w:hAnsi="Arial"/>
+              </w:rPr>
+            </w:r>
             <w:r>
               <w:rPr>
                 <w:rFonts w:ascii="Arial" w:hAnsi="Arial" w:eastAsia="Arial"/>
@@ -2954,7 +3538,11 @@
             <w:pPr>
               <w:spacing w:after="0"/>
             </w:pPr>
-            <w:r/>
+            <w:r>
+              <w:rPr>
+                <w:rFonts w:ascii="Arial" w:hAnsi="Arial"/>
+              </w:rPr>
+            </w:r>
             <w:r>
               <w:rPr>
                 <w:rFonts w:ascii="Arial" w:hAnsi="Arial" w:eastAsia="Arial"/>
@@ -2977,7 +3565,11 @@
             <w:pPr>
               <w:spacing w:after="0"/>
             </w:pPr>
-            <w:r/>
+            <w:r>
+              <w:rPr>
+                <w:rFonts w:ascii="Arial" w:hAnsi="Arial"/>
+              </w:rPr>
+            </w:r>
             <w:r>
               <w:rPr>
                 <w:rFonts w:ascii="Arial" w:hAnsi="Arial" w:eastAsia="Arial"/>
@@ -2997,7 +3589,11 @@
             <w:pPr>
               <w:spacing w:after="0"/>
             </w:pPr>
-            <w:r/>
+            <w:r>
+              <w:rPr>
+                <w:rFonts w:ascii="Arial" w:hAnsi="Arial"/>
+              </w:rPr>
+            </w:r>
             <w:r>
               <w:rPr>
                 <w:rFonts w:ascii="Arial" w:hAnsi="Arial" w:eastAsia="Arial"/>
@@ -3017,7 +3613,11 @@
             <w:pPr>
               <w:spacing w:after="0"/>
             </w:pPr>
-            <w:r/>
+            <w:r>
+              <w:rPr>
+                <w:rFonts w:ascii="Arial" w:hAnsi="Arial"/>
+              </w:rPr>
+            </w:r>
             <w:r>
               <w:rPr>
                 <w:rFonts w:ascii="Arial" w:hAnsi="Arial" w:eastAsia="Arial"/>
@@ -3039,7 +3639,11 @@
             <w:pPr>
               <w:spacing w:after="0"/>
             </w:pPr>
-            <w:r/>
+            <w:r>
+              <w:rPr>
+                <w:rFonts w:ascii="Arial" w:hAnsi="Arial"/>
+              </w:rPr>
+            </w:r>
             <w:r>
               <w:rPr>
                 <w:rFonts w:ascii="Arial" w:hAnsi="Arial" w:eastAsia="Arial"/>
@@ -3059,7 +3663,11 @@
             <w:pPr>
               <w:spacing w:after="0"/>
             </w:pPr>
-            <w:r/>
+            <w:r>
+              <w:rPr>
+                <w:rFonts w:ascii="Arial" w:hAnsi="Arial"/>
+              </w:rPr>
+            </w:r>
             <w:r>
               <w:rPr>
                 <w:rFonts w:ascii="Arial" w:hAnsi="Arial" w:eastAsia="Arial"/>
@@ -3079,7 +3687,11 @@
             <w:pPr>
               <w:spacing w:after="0"/>
             </w:pPr>
-            <w:r/>
+            <w:r>
+              <w:rPr>
+                <w:rFonts w:ascii="Arial" w:hAnsi="Arial"/>
+              </w:rPr>
+            </w:r>
             <w:r>
               <w:rPr>
                 <w:rFonts w:ascii="Arial" w:hAnsi="Arial" w:eastAsia="Arial"/>
@@ -3101,7 +3713,11 @@
             <w:pPr>
               <w:spacing w:after="0"/>
             </w:pPr>
-            <w:r/>
+            <w:r>
+              <w:rPr>
+                <w:rFonts w:ascii="Arial" w:hAnsi="Arial"/>
+              </w:rPr>
+            </w:r>
             <w:r>
               <w:rPr>
                 <w:rFonts w:ascii="Arial" w:hAnsi="Arial" w:eastAsia="Arial"/>
@@ -3121,7 +3737,11 @@
             <w:pPr>
               <w:spacing w:after="0"/>
             </w:pPr>
-            <w:r/>
+            <w:r>
+              <w:rPr>
+                <w:rFonts w:ascii="Arial" w:hAnsi="Arial"/>
+              </w:rPr>
+            </w:r>
             <w:r>
               <w:rPr>
                 <w:rFonts w:ascii="Arial" w:hAnsi="Arial" w:eastAsia="Arial"/>
@@ -3141,7 +3761,11 @@
             <w:pPr>
               <w:spacing w:after="0"/>
             </w:pPr>
-            <w:r/>
+            <w:r>
+              <w:rPr>
+                <w:rFonts w:ascii="Arial" w:hAnsi="Arial"/>
+              </w:rPr>
+            </w:r>
             <w:r>
               <w:rPr>
                 <w:rFonts w:ascii="Arial" w:hAnsi="Arial" w:eastAsia="Arial"/>
@@ -3163,7 +3787,11 @@
             <w:pPr>
               <w:spacing w:after="0"/>
             </w:pPr>
-            <w:r/>
+            <w:r>
+              <w:rPr>
+                <w:rFonts w:ascii="Arial" w:hAnsi="Arial"/>
+              </w:rPr>
+            </w:r>
             <w:r>
               <w:rPr>
                 <w:rFonts w:ascii="Arial" w:hAnsi="Arial" w:eastAsia="Arial"/>
@@ -3183,7 +3811,11 @@
             <w:pPr>
               <w:spacing w:after="0"/>
             </w:pPr>
-            <w:r/>
+            <w:r>
+              <w:rPr>
+                <w:rFonts w:ascii="Arial" w:hAnsi="Arial"/>
+              </w:rPr>
+            </w:r>
             <w:r>
               <w:rPr>
                 <w:rFonts w:ascii="Arial" w:hAnsi="Arial" w:eastAsia="Arial"/>
@@ -3203,7 +3835,11 @@
             <w:pPr>
               <w:spacing w:after="0"/>
             </w:pPr>
-            <w:r/>
+            <w:r>
+              <w:rPr>
+                <w:rFonts w:ascii="Arial" w:hAnsi="Arial"/>
+              </w:rPr>
+            </w:r>
             <w:r>
               <w:rPr>
                 <w:rFonts w:ascii="Arial" w:hAnsi="Arial" w:eastAsia="Arial"/>
@@ -3225,7 +3861,11 @@
             <w:pPr>
               <w:spacing w:after="0"/>
             </w:pPr>
-            <w:r/>
+            <w:r>
+              <w:rPr>
+                <w:rFonts w:ascii="Arial" w:hAnsi="Arial"/>
+              </w:rPr>
+            </w:r>
             <w:r>
               <w:rPr>
                 <w:rFonts w:ascii="Arial" w:hAnsi="Arial" w:eastAsia="Arial"/>
@@ -3245,7 +3885,11 @@
             <w:pPr>
               <w:spacing w:after="0"/>
             </w:pPr>
-            <w:r/>
+            <w:r>
+              <w:rPr>
+                <w:rFonts w:ascii="Arial" w:hAnsi="Arial"/>
+              </w:rPr>
+            </w:r>
             <w:r>
               <w:rPr>
                 <w:rFonts w:ascii="Arial" w:hAnsi="Arial" w:eastAsia="Arial"/>
@@ -3265,7 +3909,11 @@
             <w:pPr>
               <w:spacing w:after="0"/>
             </w:pPr>
-            <w:r/>
+            <w:r>
+              <w:rPr>
+                <w:rFonts w:ascii="Arial" w:hAnsi="Arial"/>
+              </w:rPr>
+            </w:r>
             <w:r>
               <w:rPr>
                 <w:rFonts w:ascii="Arial" w:hAnsi="Arial" w:eastAsia="Arial"/>
@@ -3287,7 +3935,11 @@
             <w:pPr>
               <w:spacing w:after="0"/>
             </w:pPr>
-            <w:r/>
+            <w:r>
+              <w:rPr>
+                <w:rFonts w:ascii="Arial" w:hAnsi="Arial"/>
+              </w:rPr>
+            </w:r>
             <w:r>
               <w:rPr>
                 <w:rFonts w:ascii="Arial" w:hAnsi="Arial" w:eastAsia="Arial"/>
@@ -3307,7 +3959,11 @@
             <w:pPr>
               <w:spacing w:after="0"/>
             </w:pPr>
-            <w:r/>
+            <w:r>
+              <w:rPr>
+                <w:rFonts w:ascii="Arial" w:hAnsi="Arial"/>
+              </w:rPr>
+            </w:r>
             <w:r>
               <w:rPr>
                 <w:rFonts w:ascii="Arial" w:hAnsi="Arial" w:eastAsia="Arial"/>
@@ -3327,7 +3983,11 @@
             <w:pPr>
               <w:spacing w:after="0"/>
             </w:pPr>
-            <w:r/>
+            <w:r>
+              <w:rPr>
+                <w:rFonts w:ascii="Arial" w:hAnsi="Arial"/>
+              </w:rPr>
+            </w:r>
             <w:r>
               <w:rPr>
                 <w:rFonts w:ascii="Arial" w:hAnsi="Arial" w:eastAsia="Arial"/>
@@ -3349,7 +4009,11 @@
             <w:pPr>
               <w:spacing w:after="0"/>
             </w:pPr>
-            <w:r/>
+            <w:r>
+              <w:rPr>
+                <w:rFonts w:ascii="Arial" w:hAnsi="Arial"/>
+              </w:rPr>
+            </w:r>
             <w:r>
               <w:rPr>
                 <w:rFonts w:ascii="Arial" w:hAnsi="Arial" w:eastAsia="Arial"/>
@@ -3369,7 +4033,11 @@
             <w:pPr>
               <w:spacing w:after="0"/>
             </w:pPr>
-            <w:r/>
+            <w:r>
+              <w:rPr>
+                <w:rFonts w:ascii="Arial" w:hAnsi="Arial"/>
+              </w:rPr>
+            </w:r>
             <w:r>
               <w:rPr>
                 <w:rFonts w:ascii="Arial" w:hAnsi="Arial" w:eastAsia="Arial"/>
@@ -3389,7 +4057,11 @@
             <w:pPr>
               <w:spacing w:after="0"/>
             </w:pPr>
-            <w:r/>
+            <w:r>
+              <w:rPr>
+                <w:rFonts w:ascii="Arial" w:hAnsi="Arial"/>
+              </w:rPr>
+            </w:r>
             <w:r>
               <w:rPr>
                 <w:rFonts w:ascii="Arial" w:hAnsi="Arial" w:eastAsia="Arial"/>
@@ -3397,6 +4069,129 @@
                 <w:sz w:val="18"/>
               </w:rPr>
               <w:t>ปรับ seed/remove legacy data และการ fetch/display session</w:t>
+            </w:r>
+          </w:p>
+        </w:tc>
+      </w:tr>
+      <w:tr>
+        <w:tc>
+          <w:tcPr>
+            <w:tcW w:type="dxa" w:w="2520"/>
+          </w:tcPr>
+          <w:p>
+            <w:r>
+              <w:rPr>
+                <w:rFonts w:ascii="Arial" w:hAnsi="Arial"/>
+              </w:rPr>
+              <w:t>แก้ skeleton overlay</w:t>
+            </w:r>
+          </w:p>
+        </w:tc>
+        <w:tc>
+          <w:tcPr>
+            <w:tcW w:type="dxa" w:w="3240"/>
+          </w:tcPr>
+          <w:p>
+            <w:r>
+              <w:rPr>
+                <w:rFonts w:ascii="Arial" w:hAnsi="Arial"/>
+              </w:rPr>
+              <w:t>Designsystem.swift, FormanalysisView.swift, Compareview.swift</w:t>
+            </w:r>
+          </w:p>
+        </w:tc>
+        <w:tc>
+          <w:tcPr>
+            <w:tcW w:type="dxa" w:w="3312"/>
+          </w:tcPr>
+          <w:p>
+            <w:r>
+              <w:rPr>
+                <w:rFonts w:ascii="Arial" w:hAnsi="Arial"/>
+              </w:rPr>
+              <w:t>ปรับ UpperBodySkeletonOverlay หรือจุดที่ส่ง bodyParts/highlightedJoints เข้า overlay</w:t>
+            </w:r>
+          </w:p>
+        </w:tc>
+      </w:tr>
+      <w:tr>
+        <w:tc>
+          <w:tcPr>
+            <w:tcW w:type="dxa" w:w="2520"/>
+          </w:tcPr>
+          <w:p>
+            <w:r>
+              <w:rPr>
+                <w:rFonts w:ascii="Arial" w:hAnsi="Arial"/>
+              </w:rPr>
+              <w:t>แก้ sync playback Compare</w:t>
+            </w:r>
+          </w:p>
+        </w:tc>
+        <w:tc>
+          <w:tcPr>
+            <w:tcW w:type="dxa" w:w="3240"/>
+          </w:tcPr>
+          <w:p>
+            <w:r>
+              <w:rPr>
+                <w:rFonts w:ascii="Arial" w:hAnsi="Arial"/>
+              </w:rPr>
+              <w:t>Compareview.swift</w:t>
+            </w:r>
+          </w:p>
+        </w:tc>
+        <w:tc>
+          <w:tcPr>
+            <w:tcW w:type="dxa" w:w="3312"/>
+          </w:tcPr>
+          <w:p>
+            <w:r>
+              <w:rPr>
+                <w:rFonts w:ascii="Arial" w:hAnsi="Arial"/>
+              </w:rPr>
+              <w:t>ดู SharedPlaybackControls และ resetPlayersForSynchronizedPlayback()</w:t>
+            </w:r>
+          </w:p>
+        </w:tc>
+      </w:tr>
+      <w:tr>
+        <w:tc>
+          <w:tcPr>
+            <w:tcW w:type="dxa" w:w="2520"/>
+          </w:tcPr>
+          <w:p>
+            <w:r>
+              <w:rPr>
+                <w:rFonts w:ascii="Arial" w:hAnsi="Arial"/>
+              </w:rPr>
+              <w:t>แก้คะแนน mirror/timing</w:t>
+            </w:r>
+          </w:p>
+        </w:tc>
+        <w:tc>
+          <w:tcPr>
+            <w:tcW w:type="dxa" w:w="3240"/>
+          </w:tcPr>
+          <w:p>
+            <w:r>
+              <w:rPr>
+                <w:rFonts w:ascii="Arial" w:hAnsi="Arial"/>
+              </w:rPr>
+              <w:t>CompareAccuracyAnalyzer.swift</w:t>
+            </w:r>
+          </w:p>
+        </w:tc>
+        <w:tc>
+          <w:tcPr>
+            <w:tcW w:type="dxa" w:w="3312"/>
+          </w:tcPr>
+          <w:p>
+            <w:r>
+              <w:rPr>
+                <w:rFonts w:ascii="Arial" w:hAnsi="Arial"/>
+              </w:rPr>
+              <w:t>ดู alignedComparablePairs และ PoseComparison.metrics(mirroredUser:)</w:t>
             </w:r>
           </w:p>
         </w:tc>
@@ -3416,11 +4211,7 @@
         <w:spacing w:after="120"/>
       </w:pPr>
       <w:r>
-        <w:rPr>
-          <w:rFonts w:ascii="Arial" w:hAnsi="Arial" w:eastAsia="Arial"/>
-          <w:sz w:val="21"/>
-        </w:rPr>
-        <w:t>แอป Exercise Together เป็น iOS Standalone App ที่ช่วยผู้ใช้ตรวจฟอร์มออกกำลังกายแบบ upper-body-only ผ่าน Apple Vision Framework โดยกล้องจะส่ง frame ให้ VNDetectHumanBodyPoseRequest ตรวจ joint จากนั้น PoseEstimator จะ validate confidence, ตรวจว่าเห็นตั้งแต่หัวถึงเอว, คำนวณมุมข้อศอก/แขน และนับ rep ตาม exercise ที่เลือก ผลลัพธ์ถูกบันทึกลง Core Data และถ้าเป็น live tracking จะบันทึกวิดีโอเข้า Photos ด้วย นอกจากนี้หน้า Compare จะโหลด reference video จาก bundle และให้ผู้ใช้อัปโหลดวิดีโอของตัวเองเพื่อคำนวณ accuracy จากความต่างของ upper-body pose.</w:t>
+        <w:t>แอป Exercise Together เป็น iOS Standalone App ที่ช่วยผู้ใช้ตรวจฟอร์มออกกำลังกายแบบ upper-body-only ผ่าน Apple Vision Framework โดยกล้องจะส่ง frame ให้ VNDetectHumanBodyPoseRequest ตรวจ joint จากนั้น PoseEstimator จะ validate confidence, ตรวจว่าเห็นตั้งแต่หัวถึงเอว, คำนวณมุมข้อศอก/แขน และนับ rep ตาม exercise ที่เลือก หน้าจอจะแสดง skeleton เฉพาะ upper body เพื่อให้เห็นว่าระบบจับอะไรอยู่ ผลลัพธ์ถูกบันทึกลง Core Data และถ้าเป็น live tracking จะบันทึกวิดีโอเข้า Photos ด้วย นอกจากนี้หน้า Compare จะโหลด reference video จาก bundle เล่นพร้อมกับ user video และคำนวณ accuracy จาก upper-body pose แบบรองรับกล้องหน้าที่ภาพอาจ mirror กัน.</w:t>
       </w:r>
     </w:p>
     <w:p>

</xml_diff>